<commit_message>
feat: add robust docx download and update demo users
Implement a programmatic file download handler for the project report and update user data to reflect the current project team.
</commit_message>
<xml_diff>
--- a/public/TrendScope_Project_Report.docx
+++ b/public/TrendScope_Project_Report.docx
@@ -68,7 +68,7 @@
     </w:p>
     <w:p>
       <w:pPr>
-        <w:spacing w:after="100" w:before="500"/>
+        <w:spacing w:after="100" w:before="400"/>
         <w:jc w:val="center"/>
       </w:pPr>
       <w:r>
@@ -79,12 +79,12 @@
           <w:sz w:val="22"/>
           <w:szCs w:val="22"/>
         </w:rPr>
-        <w:t xml:space="preserve">Submitted By:</w:t>
-      </w:r>
-    </w:p>
-    <w:p>
-      <w:pPr>
-        <w:spacing w:after="60"/>
+        <w:t xml:space="preserve">Submitted By (MCA Group Project Team):</w:t>
+      </w:r>
+    </w:p>
+    <w:p>
+      <w:pPr>
+        <w:spacing w:after="40"/>
         <w:jc w:val="center"/>
       </w:pPr>
       <w:r>
@@ -92,24 +92,56 @@
           <w:b/>
           <w:bCs/>
           <w:color w:val="111827"/>
-          <w:sz w:val="24"/>
-          <w:szCs w:val="24"/>
-        </w:rPr>
-        <w:t xml:space="preserve">Candidate Register Number: 25MCA029</w:t>
-      </w:r>
-    </w:p>
-    <w:p>
-      <w:pPr>
-        <w:spacing w:after="400"/>
+          <w:sz w:val="22"/>
+          <w:szCs w:val="22"/>
+        </w:rPr>
+        <w:t xml:space="preserve">1. M. JANANI  (Register No: 25MCA029)</w:t>
+      </w:r>
+    </w:p>
+    <w:p>
+      <w:pPr>
+        <w:spacing w:after="40"/>
         <w:jc w:val="center"/>
       </w:pPr>
       <w:r>
         <w:rPr>
+          <w:b/>
+          <w:bCs/>
+          <w:color w:val="111827"/>
+          <w:sz w:val="22"/>
+          <w:szCs w:val="22"/>
+        </w:rPr>
+        <w:t xml:space="preserve">2. D. MADHUMITHA  (Register No: 25MCA018)</w:t>
+      </w:r>
+    </w:p>
+    <w:p>
+      <w:pPr>
+        <w:spacing w:after="200"/>
+        <w:jc w:val="center"/>
+      </w:pPr>
+      <w:r>
+        <w:rPr>
+          <w:b/>
+          <w:bCs/>
+          <w:color w:val="111827"/>
+          <w:sz w:val="22"/>
+          <w:szCs w:val="22"/>
+        </w:rPr>
+        <w:t xml:space="preserve">3. G. NANDHINI  (Register No: 25MCA035)</w:t>
+      </w:r>
+    </w:p>
+    <w:p>
+      <w:pPr>
+        <w:spacing w:after="300"/>
+        <w:jc w:val="center"/>
+      </w:pPr>
+      <w:r>
+        <w:rPr>
           <w:color w:val="4B5563"/>
-          <w:sz w:val="22"/>
-          <w:szCs w:val="22"/>
-        </w:rPr>
-        <w:t xml:space="preserve">Institutional Email: 25mca029@grd.edu.in</w:t>
+          <w:sz w:val="20"/>
+          <w:szCs w:val="20"/>
+        </w:rPr>
+        <w:t xml:space="preserve">Department Contact Email: 25mca029@grd.edu.in</w:t>
       </w:r>
     </w:p>
     <w:p>
@@ -3747,7 +3779,7 @@
           <w:sz w:val="22"/>
           <w:szCs w:val="22"/>
         </w:rPr>
-        <w:t xml:space="preserve">Displays institutional branding, active dataset quick-switch selector, global search bar, dark/light toggle, theme palette selector, executive report trigger, and user profile badge (Aarav Sharma - ADMIN).</w:t>
+        <w:t xml:space="preserve">Displays institutional branding, active dataset quick-switch selector, global search bar, dark/light toggle, theme palette selector, executive report trigger, and user profile badge (M. Janani - Project Lead).</w:t>
       </w:r>
     </w:p>
     <w:p>
@@ -4079,7 +4111,7 @@
           <w:sz w:val="22"/>
           <w:szCs w:val="22"/>
         </w:rPr>
-        <w:t xml:space="preserve">For the MCA academic project submission (Register No: 25MCA029, Dr. G.R. Damodaran College of Science), responsibilities were structured across core engineering domains:</w:t>
+        <w:t xml:space="preserve">For the MCA group project submission at Dr. G.R. Damodaran College of Science, engineering and research responsibilities were divided collaboratively among the team members:</w:t>
       </w:r>
     </w:p>
     <w:tbl>
@@ -4127,7 +4159,7 @@
                 <w:sz w:val="20"/>
                 <w:szCs w:val="20"/>
               </w:rPr>
-              <w:t xml:space="preserve">Engineering Domain</w:t>
+              <w:t xml:space="preserve">Team Member &amp; Register No.</w:t>
             </w:r>
           </w:p>
         </w:tc>
@@ -4155,7 +4187,7 @@
                 <w:sz w:val="20"/>
                 <w:szCs w:val="20"/>
               </w:rPr>
-              <w:t xml:space="preserve">Assigned Lead / Personnel</w:t>
+              <w:t xml:space="preserve">Assigned Engineering Role</w:t>
             </w:r>
           </w:p>
         </w:tc>
@@ -4208,7 +4240,8 @@
                 <w:sz w:val="20"/>
                 <w:szCs w:val="20"/>
               </w:rPr>
-              <w:t xml:space="preserve">Project Architecture &amp; Full-Stack Integration</w:t>
+              <w:t xml:space="preserve">M. JANANI
+(Reg No: 25MCA029)</w:t>
             </w:r>
           </w:p>
         </w:tc>
@@ -4231,7 +4264,7 @@
                 <w:sz w:val="20"/>
                 <w:szCs w:val="20"/>
               </w:rPr>
-              <w:t xml:space="preserve">Aarav Sharma (25MCA029)</w:t>
+              <w:t xml:space="preserve">Team Lead &amp; Predictive Modeling Architect</w:t>
             </w:r>
           </w:p>
         </w:tc>
@@ -4254,7 +4287,7 @@
                 <w:sz w:val="20"/>
                 <w:szCs w:val="20"/>
               </w:rPr>
-              <w:t xml:space="preserve">Unified server setup (server.ts), Vite build configuration, Git versioning, Render cloud deployment.</w:t>
+              <w:t xml:space="preserve">Unified full-stack architecture (server.ts), time-series moving average algorithms, rate-of-change velocity metrics, confidence score calculations, and cloud deployment on Render.</w:t>
             </w:r>
           </w:p>
         </w:tc>
@@ -4279,7 +4312,8 @@
                 <w:sz w:val="20"/>
                 <w:szCs w:val="20"/>
               </w:rPr>
-              <w:t xml:space="preserve">Predictive Modeling &amp; Statistical Engine</w:t>
+              <w:t xml:space="preserve">D. MADHUMITHA
+(Reg No: 25MCA018)</w:t>
             </w:r>
           </w:p>
         </w:tc>
@@ -4302,7 +4336,7 @@
                 <w:sz w:val="20"/>
                 <w:szCs w:val="20"/>
               </w:rPr>
-              <w:t xml:space="preserve">Dr. Priya Nair (Analyst)</w:t>
+              <w:t xml:space="preserve">Relational Database Engineer</w:t>
             </w:r>
           </w:p>
         </w:tc>
@@ -4325,7 +4359,7 @@
                 <w:sz w:val="20"/>
                 <w:szCs w:val="20"/>
               </w:rPr>
-              <w:t xml:space="preserve">Formulated moving-average algorithms, rate-of-change formulas, confidence score calibration, narrative stories.</w:t>
+              <w:t xml:space="preserve">AlaSQL in-memory relational database design, ANSI SQL query parser, table schema design (users, datasets, predictions, logs), sub-millisecond execution timer, and .sql dump exporter.</w:t>
             </w:r>
           </w:p>
         </w:tc>
@@ -4350,7 +4384,8 @@
                 <w:sz w:val="20"/>
                 <w:szCs w:val="20"/>
               </w:rPr>
-              <w:t xml:space="preserve">Database Engine &amp; Web SQL Studio</w:t>
+              <w:t xml:space="preserve">G. NANDHINI
+(Reg No: 25MCA035)</w:t>
             </w:r>
           </w:p>
         </w:tc>
@@ -4373,7 +4408,7 @@
                 <w:sz w:val="20"/>
                 <w:szCs w:val="20"/>
               </w:rPr>
-              <w:t xml:space="preserve">Rohan Patel (Lead Developer)</w:t>
+              <w:t xml:space="preserve">Frontend UI/UX &amp; Data Visualization Lead</w:t>
             </w:r>
           </w:p>
         </w:tc>
@@ -4396,7 +4431,7 @@
                 <w:sz w:val="20"/>
                 <w:szCs w:val="20"/>
               </w:rPr>
-              <w:t xml:space="preserve">Built AlaSQL relational schema, ANSI query parser, performance execution timer, and .sql dump generator.</w:t>
+              <w:t xml:space="preserve">Tailwind CSS v4 design system, interactive Recharts SVG graphs (Line, Bar, Area, Breakdown), dark/light theme switching, and Executive Report modal with print/PDF features.</w:t>
             </w:r>
           </w:p>
         </w:tc>
@@ -4421,7 +4456,8 @@
                 <w:sz w:val="20"/>
                 <w:szCs w:val="20"/>
               </w:rPr>
-              <w:t xml:space="preserve">Frontend UI/UX &amp; Data Visualization</w:t>
+              <w:t xml:space="preserve">Joint Group Contribution
+(All Members)</w:t>
             </w:r>
           </w:p>
         </w:tc>
@@ -4444,7 +4480,7 @@
                 <w:sz w:val="20"/>
                 <w:szCs w:val="20"/>
               </w:rPr>
-              <w:t xml:space="preserve">Kavita Sundaram (UI Designer)</w:t>
+              <w:t xml:space="preserve">System Integration, Testing &amp; Documentation</w:t>
             </w:r>
           </w:p>
         </w:tc>
@@ -4467,78 +4503,7 @@
                 <w:sz w:val="20"/>
                 <w:szCs w:val="20"/>
               </w:rPr>
-              <w:t xml:space="preserve">Designed responsive Tailwind CSS layouts, Recharts SVG graphs, dark/light theme switcher, and report modal.</w:t>
-            </w:r>
-          </w:p>
-        </w:tc>
-      </w:tr>
-      <w:tr>
-        <w:tc>
-          <w:tcPr>
-            <w:tcW w:type="pct" w:w="25%"/>
-            <w:shd w:fill="FFFFFF" w:color="auto" w:val="clear"/>
-            <w:tcMar>
-              <w:top w:type="dxa" w:w="100"/>
-              <w:left w:type="dxa" w:w="120"/>
-              <w:bottom w:type="dxa" w:w="100"/>
-              <w:right w:type="dxa" w:w="120"/>
-            </w:tcMar>
-          </w:tcPr>
-          <w:p>
-            <w:r>
-              <w:rPr>
-                <w:rFonts w:ascii="Calibri" w:cs="Calibri" w:eastAsia="Calibri" w:hAnsi="Calibri"/>
-                <w:color w:val="1F2937"/>
-                <w:sz w:val="20"/>
-                <w:szCs w:val="20"/>
-              </w:rPr>
-              <w:t xml:space="preserve">Quality Assurance, Testing &amp; Documentation</w:t>
-            </w:r>
-          </w:p>
-        </w:tc>
-        <w:tc>
-          <w:tcPr>
-            <w:tcW w:type="pct" w:w="25%"/>
-            <w:shd w:fill="FFFFFF" w:color="auto" w:val="clear"/>
-            <w:tcMar>
-              <w:top w:type="dxa" w:w="100"/>
-              <w:left w:type="dxa" w:w="120"/>
-              <w:bottom w:type="dxa" w:w="100"/>
-              <w:right w:type="dxa" w:w="120"/>
-            </w:tcMar>
-          </w:tcPr>
-          <w:p>
-            <w:r>
-              <w:rPr>
-                <w:rFonts w:ascii="Calibri" w:cs="Calibri" w:eastAsia="Calibri" w:hAnsi="Calibri"/>
-                <w:color w:val="1F2937"/>
-                <w:sz w:val="20"/>
-                <w:szCs w:val="20"/>
-              </w:rPr>
-              <w:t xml:space="preserve">Project Team (25MCA029)</w:t>
-            </w:r>
-          </w:p>
-        </w:tc>
-        <w:tc>
-          <w:tcPr>
-            <w:tcW w:type="pct" w:w="50%"/>
-            <w:shd w:fill="FFFFFF" w:color="auto" w:val="clear"/>
-            <w:tcMar>
-              <w:top w:type="dxa" w:w="100"/>
-              <w:left w:type="dxa" w:w="120"/>
-              <w:bottom w:type="dxa" w:w="100"/>
-              <w:right w:type="dxa" w:w="120"/>
-            </w:tcMar>
-          </w:tcPr>
-          <w:p>
-            <w:r>
-              <w:rPr>
-                <w:rFonts w:ascii="Calibri" w:cs="Calibri" w:eastAsia="Calibri" w:hAnsi="Calibri"/>
-                <w:color w:val="1F2937"/>
-                <w:sz w:val="20"/>
-                <w:szCs w:val="20"/>
-              </w:rPr>
-              <w:t xml:space="preserve">Authored functional test cases, conducted browser compatibility audits, authored comprehensive technical report.</w:t>
+              <w:t xml:space="preserve">Cross-browser testing, dataset validation, academic documentation, viva presentation slides, and continuous integration testing.</w:t>
             </w:r>
           </w:p>
         </w:tc>

</xml_diff>